<commit_message>
docs: customisation manual in the docx pipeline
Adds 04-customisation-manual.docx covering all five Webstore Settings
tabs, both shipped presets, recipes and troubleshooting.

Also corrects three facts the configurable-UI work made stale in the
developer guide: the suite is 220 tests not 62, theme changes are now
configuration rather than an SCSS edit plus rebuild, and python-docx
lives in the bench venv so the documented /usr/bin/python3 invocation
never worked.
</commit_message>
<xml_diff>
--- a/docs/03-developer-guide.docx
+++ b/docs/03-developer-guide.docx
@@ -162,7 +162,7 @@
         <w:t xml:space="preserve">Dev credentials: </w:t>
       </w:r>
       <w:r>
-        <w:t>demo portal login demo@upande.com / Upande!Demo#2026; MariaDB root password on this dev machine is 'root'.</w:t>
+        <w:t>demo portal login demo@upande.com / upande123; MariaDB root password on this dev machine is 'root'.</w:t>
       </w:r>
     </w:p>
     <w:p>
@@ -439,9 +439,20 @@
         </w:rPr>
         <w:t>bench --site webstore.localhost set-config allow_tests true   # once</w:t>
         <w:br/>
-        <w:t>bench --site webstore.localhost run-tests --app upande_webstore  # full suite (62 tests)</w:t>
+        <w:t>bench --site webstore.localhost run-tests --app upande_webstore  # full suite (220 tests)</w:t>
         <w:br/>
         <w:t>bench --site webstore.localhost run-tests --module upande_webstore.tests.test_cart</w:t>
+      </w:r>
+    </w:p>
+    <w:p>
+      <w:r>
+        <w:rPr>
+          <w:b/>
+        </w:rPr>
+        <w:t xml:space="preserve">Two environment notes: </w:t>
+      </w:r>
+      <w:r>
+        <w:t>The invoice-PDF test needs a running web server (bench serve) so wkhtmltopdf can fetch print assets; it fails with a connection error otherwise. Pure-function suites (test_theme colour math) need no site and run under plain unittest.</w:t>
       </w:r>
     </w:p>
     <w:p>
@@ -496,7 +507,7 @@
         <w:t xml:space="preserve">Theme change: </w:t>
       </w:r>
       <w:r>
-        <w:t>change tokens in ONE of two places: shadcn/tailwind vars in public/tailwind/input.css, ws-* component vars in public/scss/webstore.bundle.scss (:root block). Rebuild both pipelines.</w:t>
+        <w:t>per-client changes are configuration, not code — use Webstore Settings (see the Customisation Manual); no rebuild or deploy needed. Only change the SCSS :root block in public/scss/webstore.bundle.scss when you are altering the shipped DEFAULT for every site, and remember blank settings must keep rendering identically. Derivation lives in upande_webstore/theme/color.py.</w:t>
       </w:r>
     </w:p>
     <w:p>

</xml_diff>